<commit_message>
Reword ABS follow-up doc in plainer language with fuller context
</commit_message>
<xml_diff>
--- a/feedback/ABS_followup_questions.docx
+++ b/feedback/ABS_followup_questions.docx
@@ -9,38 +9,35 @@
           <w:color w:val="081F4D"/>
           <w:sz w:val="32"/>
         </w:rPr>
-        <w:t>ABS Website — Follow-up Questions &amp; Confirmations</w:t>
+        <w:t>ABS Website — Questions and Confirmations We Need From You</w:t>
       </w:r>
     </w:p>
     <w:p>
       <w:r>
         <w:rPr>
-          <w:i/>
-          <w:color w:val="555555"/>
-          <w:sz w:val="21"/>
+          <w:sz w:val="19"/>
         </w:rPr>
-        <w:t>For ABS Certifications &amp; Advisory — to finalise the content-review implementation</w:t>
+        <w:t>What this is: We have already made the main changes from your review. The website now describes ABS as a consulting and advisory firm (not a certification body), and we have updated the ISO standards to their latest versions. To finish the rest of the work, we need a few answers, confirmations and materials from you.</w:t>
+        <w:br/>
       </w:r>
-    </w:p>
-    <w:p>
       <w:r>
         <w:rPr>
-          <w:sz w:val="18"/>
+          <w:sz w:val="19"/>
         </w:rPr>
-        <w:t xml:space="preserve">Status: the positioning correction (ABS presented as a consulting &amp; advisory firm, not a certification body) and the verified ISO edition updates from your review are DONE and live on the test site. The items below are the remaining questions, confirmations and assets we need from ABS to complete the rest. Grouped by type; please add answers in the right-hand column. Items marked </w:t>
+        <w:t xml:space="preserve">How to use this: go through the list below and write your answer in the last column. Each row explains what we are asking and why. A few rows are marked </w:t>
       </w:r>
       <w:r>
         <w:rPr>
           <w:b/>
-          <w:sz w:val="18"/>
+          <w:sz w:val="19"/>
         </w:rPr>
-        <w:t>[BLOCKS BUILD]</w:t>
+        <w:t>“needed before we can build this”</w:t>
       </w:r>
       <w:r>
         <w:rPr>
-          <w:sz w:val="18"/>
+          <w:sz w:val="19"/>
         </w:rPr>
-        <w:t xml:space="preserve"> cannot be finished without your input.</w:t>
+        <w:t xml:space="preserve"> — we cannot finish those parts until you reply.</w:t>
       </w:r>
     </w:p>
     <w:tbl>
@@ -82,7 +79,7 @@
         </w:tc>
         <w:tc>
           <w:tcPr>
-            <w:tcW w:type="dxa" w:w="2736"/>
+            <w:tcW w:type="dxa" w:w="2880"/>
             <w:shd w:val="clear" w:color="auto" w:fill="081F4D"/>
           </w:tcPr>
           <w:p>
@@ -101,7 +98,7 @@
         </w:tc>
         <w:tc>
           <w:tcPr>
-            <w:tcW w:type="dxa" w:w="4896"/>
+            <w:tcW w:type="dxa" w:w="5040"/>
             <w:shd w:val="clear" w:color="auto" w:fill="081F4D"/>
           </w:tcPr>
           <w:p>
@@ -114,7 +111,7 @@
                 <w:color w:val="FFFFFF"/>
                 <w:sz w:val="19"/>
               </w:rPr>
-              <w:t>What we need from ABS</w:t>
+              <w:t>What we are asking</w:t>
             </w:r>
           </w:p>
         </w:tc>
@@ -133,13 +130,13 @@
                 <w:color w:val="FFFFFF"/>
                 <w:sz w:val="19"/>
               </w:rPr>
-              <w:t>Why / current status</w:t>
+              <w:t>Why we are asking / where things stand</w:t>
             </w:r>
           </w:p>
         </w:tc>
         <w:tc>
           <w:tcPr>
-            <w:tcW w:type="dxa" w:w="3456"/>
+            <w:tcW w:type="dxa" w:w="3168"/>
             <w:shd w:val="clear" w:color="auto" w:fill="081F4D"/>
           </w:tcPr>
           <w:p>
@@ -152,7 +149,7 @@
                 <w:color w:val="FFFFFF"/>
                 <w:sz w:val="19"/>
               </w:rPr>
-              <w:t>ABS response</w:t>
+              <w:t>Your answer</w:t>
             </w:r>
           </w:p>
         </w:tc>
@@ -171,9 +168,9 @@
             <w:r>
               <w:rPr>
                 <w:b/>
-                <w:sz w:val="21"/>
+                <w:sz w:val="22"/>
               </w:rPr>
-              <w:t>A. Confirmations — please verify our changes</w:t>
+              <w:t>A.  Please confirm we got these right</w:t>
             </w:r>
           </w:p>
         </w:tc>
@@ -198,7 +195,7 @@
         </w:tc>
         <w:tc>
           <w:tcPr>
-            <w:tcW w:type="dxa" w:w="2736"/>
+            <w:tcW w:type="dxa" w:w="2880"/>
           </w:tcPr>
           <w:p>
             <w:pPr>
@@ -209,13 +206,13 @@
                 <w:b/>
                 <w:sz w:val="18"/>
               </w:rPr>
-              <w:t>CMMI positioning</w:t>
+              <w:t>CMMI — who runs the appraisal</w:t>
             </w:r>
           </w:p>
         </w:tc>
         <w:tc>
           <w:tcPr>
-            <w:tcW w:type="dxa" w:w="4896"/>
+            <w:tcW w:type="dxa" w:w="5040"/>
           </w:tcPr>
           <w:p>
             <w:pPr>
@@ -226,7 +223,7 @@
                 <w:b w:val="0"/>
                 <w:sz w:val="18"/>
               </w:rPr>
-              <w:t>Confirm ABS does NOT itself conduct formal CMMI appraisals (no in-house authorised Lead Appraiser). If ABS DOES hold that status, tell us and we'll restore an accurate version.</w:t>
+              <w:t>Please confirm: ABS helps clients get ready for a CMMI appraisal, but does not carry out the official appraisal itself. Is that correct? If ABS does have its own qualified CMMI appraiser and can run official appraisals, please tell us and we will word it that way instead.</w:t>
             </w:r>
           </w:p>
         </w:tc>
@@ -243,13 +240,13 @@
                 <w:b w:val="0"/>
                 <w:sz w:val="18"/>
               </w:rPr>
-              <w:t>We removed the old “since 1991 / our Certified Lead Appraisers conduct appraisals / High Maturity Appraisals” claims and reframed CMMI as implementation + appraisal-readiness consulting, with formal appraisals via authorised professionals — per your review.</w:t>
+              <w:t>The old site said ABS had run CMMI appraisals “since 1991” with its own lead appraisers. Your review said to describe ABS as helping clients prepare, with the official appraisal done by an authorised appraiser. We made that change and want to be sure it is accurate.</w:t>
             </w:r>
           </w:p>
         </w:tc>
         <w:tc>
           <w:tcPr>
-            <w:tcW w:type="dxa" w:w="3456"/>
+            <w:tcW w:type="dxa" w:w="3168"/>
           </w:tcPr>
           <w:p>
             <w:pPr>
@@ -284,7 +281,7 @@
         </w:tc>
         <w:tc>
           <w:tcPr>
-            <w:tcW w:type="dxa" w:w="2736"/>
+            <w:tcW w:type="dxa" w:w="2880"/>
           </w:tcPr>
           <w:p>
             <w:pPr>
@@ -295,13 +292,13 @@
                 <w:b/>
                 <w:sz w:val="18"/>
               </w:rPr>
-              <w:t>Statistics are substantiated</w:t>
+              <w:t>Are the numbers on the site true?</w:t>
             </w:r>
           </w:p>
         </w:tc>
         <w:tc>
           <w:tcPr>
-            <w:tcW w:type="dxa" w:w="4896"/>
+            <w:tcW w:type="dxa" w:w="5040"/>
           </w:tcPr>
           <w:p>
             <w:pPr>
@@ -312,7 +309,7 @@
                 <w:b w:val="0"/>
                 <w:sz w:val="18"/>
               </w:rPr>
-              <w:t>Confirm each figure is real and documented (we now show them with “Figures updated July 2026”): 1,200+ engagements supported; first-time success rate; 40+ countries; since 2008. If any is not substantiated, give the correct figure or we remove it.</w:t>
+              <w:t>Please confirm each of these figures is true and you have records to back it up: “1,200+ engagements supported”, the first-time success rate, “40+ countries”, and “since 2008”. If any figure is wrong or cannot be backed up, tell us the correct number or ask us to remove it.</w:t>
             </w:r>
           </w:p>
         </w:tc>
@@ -329,13 +326,13 @@
                 <w:b w:val="0"/>
                 <w:sz w:val="18"/>
               </w:rPr>
-              <w:t>Dating figures makes them read as audited — more exposure if unverified. We currently retain the numbers with reworded labels.</w:t>
+              <w:t>The site now shows these figures with a note, “Figures updated July 2026”. Adding a date makes them look officially checked, so we want to be sure they are correct before the site goes public.</w:t>
             </w:r>
           </w:p>
         </w:tc>
         <w:tc>
           <w:tcPr>
-            <w:tcW w:type="dxa" w:w="3456"/>
+            <w:tcW w:type="dxa" w:w="3168"/>
           </w:tcPr>
           <w:p>
             <w:pPr>
@@ -370,7 +367,7 @@
         </w:tc>
         <w:tc>
           <w:tcPr>
-            <w:tcW w:type="dxa" w:w="2736"/>
+            <w:tcW w:type="dxa" w:w="2880"/>
           </w:tcPr>
           <w:p>
             <w:pPr>
@@ -381,13 +378,13 @@
                 <w:b/>
                 <w:sz w:val="18"/>
               </w:rPr>
-              <w:t>Experience timeline</w:t>
+              <w:t>Which start year should we show?</w:t>
             </w:r>
           </w:p>
         </w:tc>
         <w:tc>
           <w:tcPr>
-            <w:tcW w:type="dxa" w:w="4896"/>
+            <w:tcW w:type="dxa" w:w="5040"/>
           </w:tcPr>
           <w:p>
             <w:pPr>
@@ -398,7 +395,7 @@
                 <w:b w:val="0"/>
                 <w:sz w:val="18"/>
               </w:rPr>
-              <w:t>Please confirm ONE coherent public timeline so we present it consistently (e.g. “ABS Academy training since 2004; ABS Certifications &amp; Advisory since 2008”).</w:t>
+              <w:t>Please tell us the single, correct history to show. For example: “Training since 2004; ABS Certifications &amp; Advisory since 2008.”</w:t>
             </w:r>
           </w:p>
         </w:tc>
@@ -415,13 +412,13 @@
                 <w:b w:val="0"/>
                 <w:sz w:val="18"/>
               </w:rPr>
-              <w:t>The site implies 2008 (company); the Lead Auditor page says “since 2004” (Academy); the old CMMI text said 1991. These need reconciling.</w:t>
+              <w:t>Different pages currently suggest different start years — 2008 (the company), 2004 (the training academy) and 1991 (old CMMI text). We want one consistent story across the whole site.</w:t>
             </w:r>
           </w:p>
         </w:tc>
         <w:tc>
           <w:tcPr>
-            <w:tcW w:type="dxa" w:w="3456"/>
+            <w:tcW w:type="dxa" w:w="3168"/>
           </w:tcPr>
           <w:p>
             <w:pPr>
@@ -456,7 +453,7 @@
         </w:tc>
         <w:tc>
           <w:tcPr>
-            <w:tcW w:type="dxa" w:w="2736"/>
+            <w:tcW w:type="dxa" w:w="2880"/>
           </w:tcPr>
           <w:p>
             <w:pPr>
@@ -467,13 +464,13 @@
                 <w:b/>
                 <w:sz w:val="18"/>
               </w:rPr>
-              <w:t>“1,200+ engagements supported” wording</w:t>
+              <w:t>Wording of the “1,200+” figure</w:t>
             </w:r>
           </w:p>
         </w:tc>
         <w:tc>
           <w:tcPr>
-            <w:tcW w:type="dxa" w:w="4896"/>
+            <w:tcW w:type="dxa" w:w="5040"/>
           </w:tcPr>
           <w:p>
             <w:pPr>
@@ -484,7 +481,7 @@
                 <w:b w:val="0"/>
                 <w:sz w:val="18"/>
               </w:rPr>
-              <w:t>Confirm this reworded phrasing (from “1,200+ certificates issued”) is acceptable.</w:t>
+              <w:t>We changed “1,200+ certificates issued” to “1,200+ certification and compliance engagements supported”. Please confirm this wording is fine.</w:t>
             </w:r>
           </w:p>
         </w:tc>
@@ -501,13 +498,13 @@
                 <w:b w:val="0"/>
                 <w:sz w:val="18"/>
               </w:rPr>
-              <w:t>Reworded so it doesn't imply ABS issues certificates.</w:t>
+              <w:t>The old wording made it sound like ABS issues the certificates itself. The new wording says ABS supported the projects, which fits the consulting positioning.</w:t>
             </w:r>
           </w:p>
         </w:tc>
         <w:tc>
           <w:tcPr>
-            <w:tcW w:type="dxa" w:w="3456"/>
+            <w:tcW w:type="dxa" w:w="3168"/>
           </w:tcPr>
           <w:p>
             <w:pPr>
@@ -536,9 +533,9 @@
             <w:r>
               <w:rPr>
                 <w:b/>
-                <w:sz w:val="21"/>
+                <w:sz w:val="22"/>
               </w:rPr>
-              <w:t>B. Standard / claim confirmations</w:t>
+              <w:t>B.  Questions about specific standards and claims</w:t>
             </w:r>
           </w:p>
         </w:tc>
@@ -563,7 +560,7 @@
         </w:tc>
         <w:tc>
           <w:tcPr>
-            <w:tcW w:type="dxa" w:w="2736"/>
+            <w:tcW w:type="dxa" w:w="2880"/>
           </w:tcPr>
           <w:p>
             <w:pPr>
@@ -574,13 +571,13 @@
                 <w:b/>
                 <w:sz w:val="18"/>
               </w:rPr>
-              <w:t>ISO/IEC 27017:2026 [BLOCKS BUILD]</w:t>
+              <w:t>ISO 27017 — which year to show  (needed before we can build this)</w:t>
             </w:r>
           </w:p>
         </w:tc>
         <w:tc>
           <w:tcPr>
-            <w:tcW w:type="dxa" w:w="4896"/>
+            <w:tcW w:type="dxa" w:w="5040"/>
           </w:tcPr>
           <w:p>
             <w:pPr>
@@ -591,7 +588,7 @@
                 <w:b w:val="0"/>
                 <w:sz w:val="18"/>
               </w:rPr>
-              <w:t>Has ISO formally PUBLISHED ISO/IEC 27017:2026 yet? If yes, we update the page from :2015 to :2026.</w:t>
+              <w:t>Has ISO officially published the 2026 version of ISO/IEC 27017 yet? If yes, we will update the page to “2026”. If it is not published yet, we will keep it as “2015”.</w:t>
             </w:r>
           </w:p>
         </w:tc>
@@ -608,13 +605,13 @@
                 <w:b w:val="0"/>
                 <w:sz w:val="18"/>
               </w:rPr>
-              <w:t>We held 27017 at :2015 because the 2026 edition was still at FDIS (final-draft) stage as of Apr 2026. All other editions were verified published and are updated.</w:t>
+              <w:t>As of April 2026 the 2026 version was still a final draft, not officially published. We updated every other standard to its new version but held this one until we know it is official.</w:t>
             </w:r>
           </w:p>
         </w:tc>
         <w:tc>
           <w:tcPr>
-            <w:tcW w:type="dxa" w:w="3456"/>
+            <w:tcW w:type="dxa" w:w="3168"/>
           </w:tcPr>
           <w:p>
             <w:pPr>
@@ -649,7 +646,7 @@
         </w:tc>
         <w:tc>
           <w:tcPr>
-            <w:tcW w:type="dxa" w:w="2736"/>
+            <w:tcW w:type="dxa" w:w="2880"/>
           </w:tcPr>
           <w:p>
             <w:pPr>
@@ -660,13 +657,13 @@
                 <w:b/>
                 <w:sz w:val="18"/>
               </w:rPr>
-              <w:t>Personnel certification scheme [BLOCKS BUILD]</w:t>
+              <w:t>Does ABS certify individual people?  (needed before we can build this)</w:t>
             </w:r>
           </w:p>
         </w:tc>
         <w:tc>
           <w:tcPr>
-            <w:tcW w:type="dxa" w:w="4896"/>
+            <w:tcW w:type="dxa" w:w="5040"/>
           </w:tcPr>
           <w:p>
             <w:pPr>
@@ -677,7 +674,7 @@
                 <w:b w:val="0"/>
                 <w:sz w:val="18"/>
               </w:rPr>
-              <w:t>Does ABS operate an approved/accredited personnel-certification scheme? If NO → we reframe the Personnel Certifications pages to competence/registration guidance with a disclaimer (course-completion ≠ accredited certification). If YES → name the scheme(s) so we state them accurately.</w:t>
+              <w:t>Does ABS run an official, approved scheme that certifies individual people (for example, certifying someone as a qualified lead auditor)? Please answer Yes or No. If Yes, please name the scheme. If No, we will change these pages to say ABS provides training and guidance, and that a training certificate is not the same as official personnel certification.</w:t>
             </w:r>
           </w:p>
         </w:tc>
@@ -694,13 +691,13 @@
                 <w:b w:val="0"/>
                 <w:sz w:val="18"/>
               </w:rPr>
-              <w:t>Current pages still say ABS “certifies the competence of an individual” — not yet reframed, pending your answer.</w:t>
+              <w:t>The “Personnel Certifications” pages currently say ABS certifies a person’s competence. Your review said to only claim this where there is an approved scheme. We have not changed these pages yet because it depends on your answer.</w:t>
             </w:r>
           </w:p>
         </w:tc>
         <w:tc>
           <w:tcPr>
-            <w:tcW w:type="dxa" w:w="3456"/>
+            <w:tcW w:type="dxa" w:w="3168"/>
           </w:tcPr>
           <w:p>
             <w:pPr>
@@ -735,7 +732,7 @@
         </w:tc>
         <w:tc>
           <w:tcPr>
-            <w:tcW w:type="dxa" w:w="2736"/>
+            <w:tcW w:type="dxa" w:w="2880"/>
           </w:tcPr>
           <w:p>
             <w:pPr>
@@ -746,13 +743,13 @@
                 <w:b/>
                 <w:sz w:val="18"/>
               </w:rPr>
-              <w:t>Third-party inspection accreditation</w:t>
+              <w:t>Inspection services — accreditation</w:t>
             </w:r>
           </w:p>
         </w:tc>
         <w:tc>
           <w:tcPr>
-            <w:tcW w:type="dxa" w:w="4896"/>
+            <w:tcW w:type="dxa" w:w="5040"/>
           </w:tcPr>
           <w:p>
             <w:pPr>
@@ -763,7 +760,7 @@
                 <w:b w:val="0"/>
                 <w:sz w:val="18"/>
               </w:rPr>
-              <w:t>Is ABS an accredited inspection body, or are inspections delivered through qualified/accredited partners? We'll add the accreditation-status caveat accordingly.</w:t>
+              <w:t>For third-party inspection work, is ABS itself accredited to do it, or does ABS use accredited partner inspectors? We will add a short line to match.</w:t>
             </w:r>
           </w:p>
         </w:tc>
@@ -780,13 +777,13 @@
                 <w:b w:val="0"/>
                 <w:sz w:val="18"/>
               </w:rPr>
-              <w:t>Your review asked to confirm accreditation status in the proposal and note partner delivery where required.</w:t>
+              <w:t>Your review asked us to be clear about accreditation status for inspections, and to mention partners where they are used.</w:t>
             </w:r>
           </w:p>
         </w:tc>
         <w:tc>
           <w:tcPr>
-            <w:tcW w:type="dxa" w:w="3456"/>
+            <w:tcW w:type="dxa" w:w="3168"/>
           </w:tcPr>
           <w:p>
             <w:pPr>
@@ -821,7 +818,7 @@
         </w:tc>
         <w:tc>
           <w:tcPr>
-            <w:tcW w:type="dxa" w:w="2736"/>
+            <w:tcW w:type="dxa" w:w="2880"/>
           </w:tcPr>
           <w:p>
             <w:pPr>
@@ -832,13 +829,13 @@
                 <w:b/>
                 <w:sz w:val="18"/>
               </w:rPr>
-              <w:t>PCI DSS role</w:t>
+              <w:t>PCI DSS — ABS’s role</w:t>
             </w:r>
           </w:p>
         </w:tc>
         <w:tc>
           <w:tcPr>
-            <w:tcW w:type="dxa" w:w="4896"/>
+            <w:tcW w:type="dxa" w:w="5040"/>
           </w:tcPr>
           <w:p>
             <w:pPr>
@@ -849,7 +846,7 @@
                 <w:b w:val="0"/>
                 <w:sz w:val="18"/>
               </w:rPr>
-              <w:t>Confirm ABS is advisory/readiness (not a QSA); the formal QSA assessment is by an authorised QSA.</w:t>
+              <w:t>Please confirm: ABS helps clients get ready for PCI DSS, and the official assessment (where one is needed) is carried out by an authorised assessor (a “QSA”), not by ABS.</w:t>
             </w:r>
           </w:p>
         </w:tc>
@@ -866,13 +863,13 @@
                 <w:b w:val="0"/>
                 <w:sz w:val="18"/>
               </w:rPr>
-              <w:t>We've framed it this way; confirming.</w:t>
+              <w:t>This matches your review; we have written it this way and want to confirm.</w:t>
             </w:r>
           </w:p>
         </w:tc>
         <w:tc>
           <w:tcPr>
-            <w:tcW w:type="dxa" w:w="3456"/>
+            <w:tcW w:type="dxa" w:w="3168"/>
           </w:tcPr>
           <w:p>
             <w:pPr>
@@ -907,7 +904,7 @@
         </w:tc>
         <w:tc>
           <w:tcPr>
-            <w:tcW w:type="dxa" w:w="2736"/>
+            <w:tcW w:type="dxa" w:w="2880"/>
           </w:tcPr>
           <w:p>
             <w:pPr>
@@ -918,13 +915,13 @@
                 <w:b/>
                 <w:sz w:val="18"/>
               </w:rPr>
-              <w:t>HIPAA / GDPR framing</w:t>
+              <w:t>HIPAA and GDPR wording</w:t>
             </w:r>
           </w:p>
         </w:tc>
         <w:tc>
           <w:tcPr>
-            <w:tcW w:type="dxa" w:w="4896"/>
+            <w:tcW w:type="dxa" w:w="5040"/>
           </w:tcPr>
           <w:p>
             <w:pPr>
@@ -935,7 +932,7 @@
                 <w:b w:val="0"/>
                 <w:sz w:val="18"/>
               </w:rPr>
-              <w:t>Confirm the framing: no official HIPAA certification scheme; no single universal GDPR certificate — ABS provides assessment/readiness.</w:t>
+              <w:t>Please confirm this is right: there is no official HIPAA “certificate” and no single GDPR “certificate” — ABS provides assessments and readiness support instead.</w:t>
             </w:r>
           </w:p>
         </w:tc>
@@ -952,13 +949,13 @@
                 <w:b w:val="0"/>
                 <w:sz w:val="18"/>
               </w:rPr>
-              <w:t>Matches your review; already on the pages.</w:t>
+              <w:t>This matches your review and is already on the pages.</w:t>
             </w:r>
           </w:p>
         </w:tc>
         <w:tc>
           <w:tcPr>
-            <w:tcW w:type="dxa" w:w="3456"/>
+            <w:tcW w:type="dxa" w:w="3168"/>
           </w:tcPr>
           <w:p>
             <w:pPr>
@@ -987,9 +984,9 @@
             <w:r>
               <w:rPr>
                 <w:b/>
-                <w:sz w:val="21"/>
+                <w:sz w:val="22"/>
               </w:rPr>
-              <w:t>C. Data &amp; assets we need [each BLOCKS its page]</w:t>
+              <w:t>C.  Information and materials we need from you</w:t>
             </w:r>
           </w:p>
         </w:tc>
@@ -1014,7 +1011,7 @@
         </w:tc>
         <w:tc>
           <w:tcPr>
-            <w:tcW w:type="dxa" w:w="2736"/>
+            <w:tcW w:type="dxa" w:w="2880"/>
           </w:tcPr>
           <w:p>
             <w:pPr>
@@ -1025,13 +1022,13 @@
                 <w:b/>
                 <w:sz w:val="18"/>
               </w:rPr>
-              <w:t>Legal-entity details</w:t>
+              <w:t>Company legal details  (needed before we can build this)</w:t>
             </w:r>
           </w:p>
         </w:tc>
         <w:tc>
           <w:tcPr>
-            <w:tcW w:type="dxa" w:w="4896"/>
+            <w:tcW w:type="dxa" w:w="5040"/>
           </w:tcPr>
           <w:p>
             <w:pPr>
@@ -1042,7 +1039,7 @@
                 <w:b w:val="0"/>
                 <w:sz w:val="18"/>
               </w:rPr>
-              <w:t>Registered legal name, registered office address, company registration number, GST number, official email, privacy contact, governing-law jurisdiction.</w:t>
+              <w:t>Please send: the full registered company name, registered office address, company registration number, GST number, an official email address, a contact for privacy questions, and the country whose laws apply.</w:t>
             </w:r>
           </w:p>
         </w:tc>
@@ -1059,13 +1056,13 @@
                 <w:b w:val="0"/>
                 <w:sz w:val="18"/>
               </w:rPr>
-              <w:t>Needed for the footer, Privacy Policy and Terms. (Privacy Policy currently still contains placeholder text incl. the wrong “hmlcerts.com” domain.)</w:t>
+              <w:t>We need these for the website footer, the Privacy Policy and the Terms page. The Privacy Policy currently still has placeholder text — and even shows the wrong website name, “hmlcerts.com”, which must be replaced.</w:t>
             </w:r>
           </w:p>
         </w:tc>
         <w:tc>
           <w:tcPr>
-            <w:tcW w:type="dxa" w:w="3456"/>
+            <w:tcW w:type="dxa" w:w="3168"/>
           </w:tcPr>
           <w:p>
             <w:pPr>
@@ -1100,7 +1097,7 @@
         </w:tc>
         <w:tc>
           <w:tcPr>
-            <w:tcW w:type="dxa" w:w="2736"/>
+            <w:tcW w:type="dxa" w:w="2880"/>
           </w:tcPr>
           <w:p>
             <w:pPr>
@@ -1111,13 +1108,13 @@
                 <w:b/>
                 <w:sz w:val="18"/>
               </w:rPr>
-              <w:t>Scheduling tool</w:t>
+              <w:t>Which online booking tool?</w:t>
             </w:r>
           </w:p>
         </w:tc>
         <w:tc>
           <w:tcPr>
-            <w:tcW w:type="dxa" w:w="4896"/>
+            <w:tcW w:type="dxa" w:w="5040"/>
           </w:tcPr>
           <w:p>
             <w:pPr>
@@ -1128,7 +1125,7 @@
                 <w:b w:val="0"/>
                 <w:sz w:val="18"/>
               </w:rPr>
-              <w:t>Which tool for “Book a Call” — Calendly / Zoho Bookings / MS Bookings — and the booking link/account.</w:t>
+              <w:t>For the “Book a call” button, which tool would you like — Calendly, Zoho Bookings, or Microsoft Bookings? Please share the account or booking link.</w:t>
             </w:r>
           </w:p>
         </w:tc>
@@ -1145,13 +1142,13 @@
                 <w:b w:val="0"/>
                 <w:sz w:val="18"/>
               </w:rPr>
-              <w:t>“Book a call” currently routes to the contact page; you asked for a real scheduler.</w:t>
+              <w:t>Right now the button just opens the contact page. Your review asked for a real booking calendar so visitors can pick a time slot themselves.</w:t>
             </w:r>
           </w:p>
         </w:tc>
         <w:tc>
           <w:tcPr>
-            <w:tcW w:type="dxa" w:w="3456"/>
+            <w:tcW w:type="dxa" w:w="3168"/>
           </w:tcPr>
           <w:p>
             <w:pPr>
@@ -1186,7 +1183,7 @@
         </w:tc>
         <w:tc>
           <w:tcPr>
-            <w:tcW w:type="dxa" w:w="2736"/>
+            <w:tcW w:type="dxa" w:w="2880"/>
           </w:tcPr>
           <w:p>
             <w:pPr>
@@ -1197,13 +1194,13 @@
                 <w:b/>
                 <w:sz w:val="18"/>
               </w:rPr>
-              <w:t>Leadership &amp; Experts</w:t>
+              <w:t>Team profiles for the About page</w:t>
             </w:r>
           </w:p>
         </w:tc>
         <w:tc>
           <w:tcPr>
-            <w:tcW w:type="dxa" w:w="4896"/>
+            <w:tcW w:type="dxa" w:w="5040"/>
           </w:tcPr>
           <w:p>
             <w:pPr>
@@ -1214,7 +1211,7 @@
                 <w:b w:val="0"/>
                 <w:sz w:val="18"/>
               </w:rPr>
-              <w:t>For each key consultant/leader: name, role, years of experience, qualifications, ISO lead-auditor credentials, LinkedIn URL.</w:t>
+              <w:t>For each senior consultant or leader you want featured, please send: name, role, years of experience, qualifications, any lead-auditor credentials, and a LinkedIn link.</w:t>
             </w:r>
           </w:p>
         </w:tc>
@@ -1231,13 +1228,13 @@
                 <w:b w:val="0"/>
                 <w:sz w:val="18"/>
               </w:rPr>
-              <w:t>For the new About “Leadership &amp; Experts” section (E-E-A-T / trust).</w:t>
+              <w:t>Your review asked for a “Leadership &amp; Experts” section on the About page. Real, named experts build trust with buyers and help the site rank on Google.</w:t>
             </w:r>
           </w:p>
         </w:tc>
         <w:tc>
           <w:tcPr>
-            <w:tcW w:type="dxa" w:w="3456"/>
+            <w:tcW w:type="dxa" w:w="3168"/>
           </w:tcPr>
           <w:p>
             <w:pPr>
@@ -1272,7 +1269,7 @@
         </w:tc>
         <w:tc>
           <w:tcPr>
-            <w:tcW w:type="dxa" w:w="2736"/>
+            <w:tcW w:type="dxa" w:w="2880"/>
           </w:tcPr>
           <w:p>
             <w:pPr>
@@ -1283,13 +1280,13 @@
                 <w:b/>
                 <w:sz w:val="18"/>
               </w:rPr>
-              <w:t>Customer logos</w:t>
+              <w:t>Client logos</w:t>
             </w:r>
           </w:p>
         </w:tc>
         <w:tc>
           <w:tcPr>
-            <w:tcW w:type="dxa" w:w="4896"/>
+            <w:tcW w:type="dxa" w:w="5040"/>
           </w:tcPr>
           <w:p>
             <w:pPr>
@@ -1300,7 +1297,7 @@
                 <w:b w:val="0"/>
                 <w:sz w:val="18"/>
               </w:rPr>
-              <w:t>Which clients have given WRITTEN permission to display their logo? Please send the logo files.</w:t>
+              <w:t>Which clients have given written permission to show their logo on the site? Please send those logo files.</w:t>
             </w:r>
           </w:p>
         </w:tc>
@@ -1317,13 +1314,13 @@
                 <w:b w:val="0"/>
                 <w:sz w:val="18"/>
               </w:rPr>
-              <w:t>The “trusted by” strip stays hidden until real, permissioned logos exist.</w:t>
+              <w:t>We only show client logos where there is written permission. Until then, the logo strip stays hidden.</w:t>
             </w:r>
           </w:p>
         </w:tc>
         <w:tc>
           <w:tcPr>
-            <w:tcW w:type="dxa" w:w="3456"/>
+            <w:tcW w:type="dxa" w:w="3168"/>
           </w:tcPr>
           <w:p>
             <w:pPr>
@@ -1358,7 +1355,7 @@
         </w:tc>
         <w:tc>
           <w:tcPr>
-            <w:tcW w:type="dxa" w:w="2736"/>
+            <w:tcW w:type="dxa" w:w="2880"/>
           </w:tcPr>
           <w:p>
             <w:pPr>
@@ -1375,7 +1372,7 @@
         </w:tc>
         <w:tc>
           <w:tcPr>
-            <w:tcW w:type="dxa" w:w="4896"/>
+            <w:tcW w:type="dxa" w:w="5040"/>
           </w:tcPr>
           <w:p>
             <w:pPr>
@@ -1386,7 +1383,7 @@
                 <w:b w:val="0"/>
                 <w:sz w:val="18"/>
               </w:rPr>
-              <w:t>2–3 real, approved stories: Client profile → Challenge → Scope → Approach → Deliverables → Timeline → Outcome → Client feedback.</w:t>
+              <w:t>Please provide 2–3 real, approved client stories. For each: the client, the challenge, what was in scope, what ABS did, what was delivered, how long it took, the outcome, and a short client quote.</w:t>
             </w:r>
           </w:p>
         </w:tc>
@@ -1403,13 +1400,13 @@
                 <w:b w:val="0"/>
                 <w:sz w:val="18"/>
               </w:rPr>
-              <w:t>Case-study section is scaffolded but empty (draft).</w:t>
+              <w:t>The case-studies section is built but empty. Real stories are strong proof for prospects.</w:t>
             </w:r>
           </w:p>
         </w:tc>
         <w:tc>
           <w:tcPr>
-            <w:tcW w:type="dxa" w:w="3456"/>
+            <w:tcW w:type="dxa" w:w="3168"/>
           </w:tcPr>
           <w:p>
             <w:pPr>
@@ -1444,7 +1441,7 @@
         </w:tc>
         <w:tc>
           <w:tcPr>
-            <w:tcW w:type="dxa" w:w="2736"/>
+            <w:tcW w:type="dxa" w:w="2880"/>
           </w:tcPr>
           <w:p>
             <w:pPr>
@@ -1455,13 +1452,13 @@
                 <w:b/>
                 <w:sz w:val="18"/>
               </w:rPr>
-              <w:t>Testimonials attribution</w:t>
+              <w:t>Names on testimonials</w:t>
             </w:r>
           </w:p>
         </w:tc>
         <w:tc>
           <w:tcPr>
-            <w:tcW w:type="dxa" w:w="4896"/>
+            <w:tcW w:type="dxa" w:w="5040"/>
           </w:tcPr>
           <w:p>
             <w:pPr>
@@ -1472,7 +1469,7 @@
                 <w:b w:val="0"/>
                 <w:sz w:val="18"/>
               </w:rPr>
-              <w:t>May we show name / designation / company / country / service (with written permission)? Where confidential, confirm a labelled role (e.g. “CISO, UK-based SaaS company”).</w:t>
+              <w:t>For the client testimonials, may we show the person’s name, job title, company, country and service (with their written permission)? Where a client must stay anonymous, is a description such as “CISO, UK-based SaaS company” acceptable?</w:t>
             </w:r>
           </w:p>
         </w:tc>
@@ -1489,13 +1486,13 @@
                 <w:b w:val="0"/>
                 <w:sz w:val="18"/>
               </w:rPr>
-              <w:t>We hold 3 real testimonials with minimal attribution.</w:t>
+              <w:t>We have three real testimonials but with very little detail. Adding names (with permission) makes them far more believable.</w:t>
             </w:r>
           </w:p>
         </w:tc>
         <w:tc>
           <w:tcPr>
-            <w:tcW w:type="dxa" w:w="3456"/>
+            <w:tcW w:type="dxa" w:w="3168"/>
           </w:tcPr>
           <w:p>
             <w:pPr>
@@ -1530,7 +1527,7 @@
         </w:tc>
         <w:tc>
           <w:tcPr>
-            <w:tcW w:type="dxa" w:w="2736"/>
+            <w:tcW w:type="dxa" w:w="2880"/>
           </w:tcPr>
           <w:p>
             <w:pPr>
@@ -1541,13 +1538,13 @@
                 <w:b/>
                 <w:sz w:val="18"/>
               </w:rPr>
-              <w:t>Blog authorship</w:t>
+              <w:t>Blog authors and review dates</w:t>
             </w:r>
           </w:p>
         </w:tc>
         <w:tc>
           <w:tcPr>
-            <w:tcW w:type="dxa" w:w="4896"/>
+            <w:tcW w:type="dxa" w:w="5040"/>
           </w:tcPr>
           <w:p>
             <w:pPr>
@@ -1558,7 +1555,7 @@
                 <w:b w:val="0"/>
                 <w:sz w:val="18"/>
               </w:rPr>
-              <w:t>A real author name + professional designation, and a reviewer name. Also: which articles have ACTUALLY been reviewed/updated, so we add a truthful “reviewed/updated” notice only where true.</w:t>
+              <w:t>Please give a real author name and job title (and a reviewer name) to show on articles. Also, please tell us which articles have actually been checked or updated recently, so we only add an “updated” note where it is true.</w:t>
             </w:r>
           </w:p>
         </w:tc>
@@ -1575,13 +1572,13 @@
                 <w:b w:val="0"/>
                 <w:sz w:val="18"/>
               </w:rPr>
-              <w:t>Articles currently show author “ABS Certifications”; real named authors/reviewers are needed for credibility.</w:t>
+              <w:t>Articles currently show “ABS Certifications” as the author. Real, named authors improve credibility and Google trust. We do not want to claim an article was updated if it was not.</w:t>
             </w:r>
           </w:p>
         </w:tc>
         <w:tc>
           <w:tcPr>
-            <w:tcW w:type="dxa" w:w="3456"/>
+            <w:tcW w:type="dxa" w:w="3168"/>
           </w:tcPr>
           <w:p>
             <w:pPr>
@@ -1616,7 +1613,7 @@
         </w:tc>
         <w:tc>
           <w:tcPr>
-            <w:tcW w:type="dxa" w:w="2736"/>
+            <w:tcW w:type="dxa" w:w="2880"/>
           </w:tcPr>
           <w:p>
             <w:pPr>
@@ -1633,7 +1630,7 @@
         </w:tc>
         <w:tc>
           <w:tcPr>
-            <w:tcW w:type="dxa" w:w="4896"/>
+            <w:tcW w:type="dxa" w:w="5040"/>
           </w:tcPr>
           <w:p>
             <w:pPr>
@@ -1644,7 +1641,7 @@
                 <w:b w:val="0"/>
                 <w:sz w:val="18"/>
               </w:rPr>
-              <w:t>Add the third number shown on the live site: +91 99116 02258?</w:t>
+              <w:t>Should we add the third phone number shown on your current website: +91 99116 02258?</w:t>
             </w:r>
           </w:p>
         </w:tc>
@@ -1661,13 +1658,13 @@
                 <w:b w:val="0"/>
                 <w:sz w:val="18"/>
               </w:rPr>
-              <w:t>Contact page currently lists two numbers.</w:t>
+              <w:t>The contact page currently lists two numbers.</w:t>
             </w:r>
           </w:p>
         </w:tc>
         <w:tc>
           <w:tcPr>
-            <w:tcW w:type="dxa" w:w="3456"/>
+            <w:tcW w:type="dxa" w:w="3168"/>
           </w:tcPr>
           <w:p>
             <w:pPr>
@@ -1702,7 +1699,7 @@
         </w:tc>
         <w:tc>
           <w:tcPr>
-            <w:tcW w:type="dxa" w:w="2736"/>
+            <w:tcW w:type="dxa" w:w="2880"/>
           </w:tcPr>
           <w:p>
             <w:pPr>
@@ -1713,13 +1710,13 @@
                 <w:b/>
                 <w:sz w:val="18"/>
               </w:rPr>
-              <w:t>Verified social profiles</w:t>
+              <w:t>Social media links</w:t>
             </w:r>
           </w:p>
         </w:tc>
         <w:tc>
           <w:tcPr>
-            <w:tcW w:type="dxa" w:w="4896"/>
+            <w:tcW w:type="dxa" w:w="5040"/>
           </w:tcPr>
           <w:p>
             <w:pPr>
@@ -1730,7 +1727,7 @@
                 <w:b w:val="0"/>
                 <w:sz w:val="18"/>
               </w:rPr>
-              <w:t>Official LinkedIn / X / YouTube URLs.</w:t>
+              <w:t>Please send the official links for LinkedIn, X (Twitter) and YouTube.</w:t>
             </w:r>
           </w:p>
         </w:tc>
@@ -1747,13 +1744,13 @@
                 <w:b w:val="0"/>
                 <w:sz w:val="18"/>
               </w:rPr>
-              <w:t>Footer social icons are placeholders (#).</w:t>
+              <w:t>The footer social icons are placeholders at the moment and do not link anywhere.</w:t>
             </w:r>
           </w:p>
         </w:tc>
         <w:tc>
           <w:tcPr>
-            <w:tcW w:type="dxa" w:w="3456"/>
+            <w:tcW w:type="dxa" w:w="3168"/>
           </w:tcPr>
           <w:p>
             <w:pPr>
@@ -1788,7 +1785,7 @@
         </w:tc>
         <w:tc>
           <w:tcPr>
-            <w:tcW w:type="dxa" w:w="2736"/>
+            <w:tcW w:type="dxa" w:w="2880"/>
           </w:tcPr>
           <w:p>
             <w:pPr>
@@ -1799,13 +1796,13 @@
                 <w:b/>
                 <w:sz w:val="18"/>
               </w:rPr>
-              <w:t>ISMS policy</w:t>
+              <w:t>Information security (ISMS) policy</w:t>
             </w:r>
           </w:p>
         </w:tc>
         <w:tc>
           <w:tcPr>
-            <w:tcW w:type="dxa" w:w="4896"/>
+            <w:tcW w:type="dxa" w:w="5040"/>
           </w:tcPr>
           <w:p>
             <w:pPr>
@@ -1816,7 +1813,7 @@
                 <w:b w:val="0"/>
                 <w:sz w:val="18"/>
               </w:rPr>
-              <w:t>Publish the approved ISMS / Information Security Policy statement, or remove the footer link until available?</w:t>
+              <w:t>Do you have an approved Information Security policy statement we can publish? If not, we will remove the “ISMS policy” link for now.</w:t>
             </w:r>
           </w:p>
         </w:tc>
@@ -1833,13 +1830,13 @@
                 <w:b w:val="0"/>
                 <w:sz w:val="18"/>
               </w:rPr>
-              <w:t>Footer shows an “ISMS policy” label with no page behind it.</w:t>
+              <w:t>The footer shows an “ISMS policy” link, but there is no page behind it yet.</w:t>
             </w:r>
           </w:p>
         </w:tc>
         <w:tc>
           <w:tcPr>
-            <w:tcW w:type="dxa" w:w="3456"/>
+            <w:tcW w:type="dxa" w:w="3168"/>
           </w:tcPr>
           <w:p>
             <w:pPr>
@@ -1868,9 +1865,9 @@
             <w:r>
               <w:rPr>
                 <w:b/>
-                <w:sz w:val="21"/>
+                <w:sz w:val="22"/>
               </w:rPr>
-              <w:t>D. Scope &amp; structure decisions</w:t>
+              <w:t>D.  Decisions about the site’s structure</w:t>
             </w:r>
           </w:p>
         </w:tc>
@@ -1895,7 +1892,7 @@
         </w:tc>
         <w:tc>
           <w:tcPr>
-            <w:tcW w:type="dxa" w:w="2736"/>
+            <w:tcW w:type="dxa" w:w="2880"/>
           </w:tcPr>
           <w:p>
             <w:pPr>
@@ -1906,13 +1903,13 @@
                 <w:b/>
                 <w:sz w:val="18"/>
               </w:rPr>
-              <w:t>Navigation restructure</w:t>
+              <w:t>Top menu layout</w:t>
             </w:r>
           </w:p>
         </w:tc>
         <w:tc>
           <w:tcPr>
-            <w:tcW w:type="dxa" w:w="4896"/>
+            <w:tcW w:type="dxa" w:w="5040"/>
           </w:tcPr>
           <w:p>
             <w:pPr>
@@ -1923,7 +1920,7 @@
                 <w:b w:val="0"/>
                 <w:sz w:val="18"/>
               </w:rPr>
-              <w:t>Adopt “Services · Industries · Standards · Resources · About · Contact” with a Standards mega-menu? Your list omits Process and Blog — you praised the Process page, so confirm we keep it reachable, and where Blog belongs.</w:t>
+              <w:t>Would you like the top menu changed to: Services · Industries · Standards · Resources · About · Contact (with a drop-down for the standards)? Your suggested list did not include “Process” or “Blog” — since you praised the Process page, where would you like Process and Blog to sit?</w:t>
             </w:r>
           </w:p>
         </w:tc>
@@ -1940,13 +1937,13 @@
                 <w:b w:val="0"/>
                 <w:sz w:val="18"/>
               </w:rPr>
-              <w:t>Current nav: Home · About · Services · Process · Blog · Contact.</w:t>
+              <w:t>The current menu is: Home · About · Services · Process · Blog · Contact.</w:t>
             </w:r>
           </w:p>
         </w:tc>
         <w:tc>
           <w:tcPr>
-            <w:tcW w:type="dxa" w:w="3456"/>
+            <w:tcW w:type="dxa" w:w="3168"/>
           </w:tcPr>
           <w:p>
             <w:pPr>
@@ -1981,7 +1978,7 @@
         </w:tc>
         <w:tc>
           <w:tcPr>
-            <w:tcW w:type="dxa" w:w="2736"/>
+            <w:tcW w:type="dxa" w:w="2880"/>
           </w:tcPr>
           <w:p>
             <w:pPr>
@@ -1992,13 +1989,13 @@
                 <w:b/>
                 <w:sz w:val="18"/>
               </w:rPr>
-              <w:t>“Business Advisory” grouping</w:t>
+              <w:t>Grouping HR, Data and Agile</w:t>
             </w:r>
           </w:p>
         </w:tc>
         <w:tc>
           <w:tcPr>
-            <w:tcW w:type="dxa" w:w="4896"/>
+            <w:tcW w:type="dxa" w:w="5040"/>
           </w:tcPr>
           <w:p>
             <w:pPr>
@@ -2009,7 +2006,7 @@
                 <w:b w:val="0"/>
                 <w:sz w:val="18"/>
               </w:rPr>
-              <w:t>Move HR / Data Analytics / Agile under a separate Business Advisory category?</w:t>
+              <w:t>Should we group the HR, Data Analytics and Agile services under a separate “Business Advisory” heading, as your review suggested?</w:t>
             </w:r>
           </w:p>
         </w:tc>
@@ -2026,13 +2023,13 @@
                 <w:b w:val="0"/>
                 <w:sz w:val="18"/>
               </w:rPr>
-              <w:t>Currently all 10 areas sit as flat service categories.</w:t>
+              <w:t>Right now all ten service areas sit at the same level in the menu.</w:t>
             </w:r>
           </w:p>
         </w:tc>
         <w:tc>
           <w:tcPr>
-            <w:tcW w:type="dxa" w:w="3456"/>
+            <w:tcW w:type="dxa" w:w="3168"/>
           </w:tcPr>
           <w:p>
             <w:pPr>
@@ -2067,7 +2064,7 @@
         </w:tc>
         <w:tc>
           <w:tcPr>
-            <w:tcW w:type="dxa" w:w="2736"/>
+            <w:tcW w:type="dxa" w:w="2880"/>
           </w:tcPr>
           <w:p>
             <w:pPr>
@@ -2078,13 +2075,13 @@
                 <w:b/>
                 <w:sz w:val="18"/>
               </w:rPr>
-              <w:t>Service-label renames</w:t>
+              <w:t>Service page titles</w:t>
             </w:r>
           </w:p>
         </w:tc>
         <w:tc>
           <w:tcPr>
-            <w:tcW w:type="dxa" w:w="4896"/>
+            <w:tcW w:type="dxa" w:w="5040"/>
           </w:tcPr>
           <w:p>
             <w:pPr>
@@ -2095,7 +2092,7 @@
                 <w:b w:val="0"/>
                 <w:sz w:val="18"/>
               </w:rPr>
-              <w:t>Rename headings to “ISO 9001 Certification Consulting”, “ISO 27001 Implementation &amp; Certification Support”, etc.? Confirm the pattern.</w:t>
+              <w:t>Would you like service pages renamed to the consulting style — for example “ISO 9001 Certification Consulting”, “ISO 27001 Implementation &amp; Certification Support”? Please confirm you want this pattern.</w:t>
             </w:r>
           </w:p>
         </w:tc>
@@ -2112,13 +2109,13 @@
                 <w:b w:val="0"/>
                 <w:sz w:val="18"/>
               </w:rPr>
-              <w:t>Bulk change across ~70 service pages.</w:t>
+              <w:t>This is a rename across roughly 70 service pages, so we want to confirm before doing it.</w:t>
             </w:r>
           </w:p>
         </w:tc>
         <w:tc>
           <w:tcPr>
-            <w:tcW w:type="dxa" w:w="3456"/>
+            <w:tcW w:type="dxa" w:w="3168"/>
           </w:tcPr>
           <w:p>
             <w:pPr>
@@ -2153,7 +2150,7 @@
         </w:tc>
         <w:tc>
           <w:tcPr>
-            <w:tcW w:type="dxa" w:w="2736"/>
+            <w:tcW w:type="dxa" w:w="2880"/>
           </w:tcPr>
           <w:p>
             <w:pPr>
@@ -2164,13 +2161,13 @@
                 <w:b/>
                 <w:sz w:val="18"/>
               </w:rPr>
-              <w:t>URL scheme</w:t>
+              <w:t>Web addresses of pages</w:t>
             </w:r>
           </w:p>
         </w:tc>
         <w:tc>
           <w:tcPr>
-            <w:tcW w:type="dxa" w:w="4896"/>
+            <w:tcW w:type="dxa" w:w="5040"/>
           </w:tcPr>
           <w:p>
             <w:pPr>
@@ -2181,7 +2178,7 @@
                 <w:b w:val="0"/>
                 <w:sz w:val="18"/>
               </w:rPr>
-              <w:t>Your review suggests short URLs like /iso-27001-consulting. Current is /services/iso-27001. As the site isn't live at abscerts.com yet, we can set final URLs now — do you want the /...-consulting scheme (we add redirects), or keep /services/...?</w:t>
+              <w:t>Your review suggested short web addresses like /iso-27001-consulting. Ours are currently /services/iso-27001. Because the new site is not live yet, we can set the final addresses now. Which do you prefer? (We will set up redirects either way.)</w:t>
             </w:r>
           </w:p>
         </w:tc>
@@ -2198,13 +2195,13 @@
                 <w:b w:val="0"/>
                 <w:sz w:val="18"/>
               </w:rPr>
-              <w:t>URL changes need redirects and affect SEO; best decided pre-launch.</w:t>
+              <w:t>Changing web addresses after launch needs redirects and can affect Google ranking, so it is best decided before the site goes live.</w:t>
             </w:r>
           </w:p>
         </w:tc>
         <w:tc>
           <w:tcPr>
-            <w:tcW w:type="dxa" w:w="3456"/>
+            <w:tcW w:type="dxa" w:w="3168"/>
           </w:tcPr>
           <w:p>
             <w:pPr>
@@ -2239,7 +2236,7 @@
         </w:tc>
         <w:tc>
           <w:tcPr>
-            <w:tcW w:type="dxa" w:w="2736"/>
+            <w:tcW w:type="dxa" w:w="2880"/>
           </w:tcPr>
           <w:p>
             <w:pPr>
@@ -2250,13 +2247,13 @@
                 <w:b/>
                 <w:sz w:val="18"/>
               </w:rPr>
-              <w:t>Country landing pages</w:t>
+              <w:t>Country pages</w:t>
             </w:r>
           </w:p>
         </w:tc>
         <w:tc>
           <w:tcPr>
-            <w:tcW w:type="dxa" w:w="4896"/>
+            <w:tcW w:type="dxa" w:w="5040"/>
           </w:tcPr>
           <w:p>
             <w:pPr>
@@ -2267,7 +2264,7 @@
                 <w:b w:val="0"/>
                 <w:sz w:val="18"/>
               </w:rPr>
-              <w:t>Which countries (UAE, USA, UK, …)? These need GENUINELY local content — can ABS supply local specifics per country? (Thin/duplicated per-country pages are penalised by Google.)</w:t>
+              <w:t>Which countries should get their own page (for example UAE, USA, UK)? To do these well we will need genuinely local details from you for each country — thin or copy-pasted country pages can actually hurt Google ranking.</w:t>
             </w:r>
           </w:p>
         </w:tc>
@@ -2284,13 +2281,13 @@
                 <w:b w:val="0"/>
                 <w:sz w:val="18"/>
               </w:rPr>
-              <w:t>None exist yet.</w:t>
+              <w:t>There are no country-specific pages yet.</w:t>
             </w:r>
           </w:p>
         </w:tc>
         <w:tc>
           <w:tcPr>
-            <w:tcW w:type="dxa" w:w="3456"/>
+            <w:tcW w:type="dxa" w:w="3168"/>
           </w:tcPr>
           <w:p>
             <w:pPr>
@@ -2325,7 +2322,7 @@
         </w:tc>
         <w:tc>
           <w:tcPr>
-            <w:tcW w:type="dxa" w:w="2736"/>
+            <w:tcW w:type="dxa" w:w="2880"/>
           </w:tcPr>
           <w:p>
             <w:pPr>
@@ -2336,13 +2333,13 @@
                 <w:b/>
                 <w:sz w:val="18"/>
               </w:rPr>
-              <w:t>Industry landing pages</w:t>
+              <w:t>Industry pages</w:t>
             </w:r>
           </w:p>
         </w:tc>
         <w:tc>
           <w:tcPr>
-            <w:tcW w:type="dxa" w:w="4896"/>
+            <w:tcW w:type="dxa" w:w="5040"/>
           </w:tcPr>
           <w:p>
             <w:pPr>
@@ -2353,7 +2350,7 @@
                 <w:b w:val="0"/>
                 <w:sz w:val="18"/>
               </w:rPr>
-              <w:t>Expand from the current 4 (finance, healthcare, manufacturing, SaaS) to 8 (add construction, logistics, education, IT services…)? Please supply sector specifics.</w:t>
+              <w:t>We have 4 industry pages (finance, healthcare, manufacturing, and software/SaaS). Would you like more — for example construction, logistics, education, IT services? If so, please share the key points for each new sector.</w:t>
             </w:r>
           </w:p>
         </w:tc>
@@ -2370,13 +2367,13 @@
                 <w:b w:val="0"/>
                 <w:sz w:val="18"/>
               </w:rPr>
-              <w:t>4 industry pages exist.</w:t>
+              <w:t>Your review suggested covering more industries.</w:t>
             </w:r>
           </w:p>
         </w:tc>
         <w:tc>
           <w:tcPr>
-            <w:tcW w:type="dxa" w:w="3456"/>
+            <w:tcW w:type="dxa" w:w="3168"/>
           </w:tcPr>
           <w:p>
             <w:pPr>
@@ -2411,7 +2408,7 @@
         </w:tc>
         <w:tc>
           <w:tcPr>
-            <w:tcW w:type="dxa" w:w="2736"/>
+            <w:tcW w:type="dxa" w:w="2880"/>
           </w:tcPr>
           <w:p>
             <w:pPr>
@@ -2422,13 +2419,13 @@
                 <w:b/>
                 <w:sz w:val="18"/>
               </w:rPr>
-              <w:t>Contact form redesign</w:t>
+              <w:t>Contact form</w:t>
             </w:r>
           </w:p>
         </w:tc>
         <w:tc>
           <w:tcPr>
-            <w:tcW w:type="dxa" w:w="4896"/>
+            <w:tcW w:type="dxa" w:w="5040"/>
           </w:tcPr>
           <w:p>
             <w:pPr>
@@ -2439,7 +2436,7 @@
                 <w:b w:val="0"/>
                 <w:sz w:val="18"/>
               </w:rPr>
-              <w:t>Implement the two-step form + file upload (existing certificate / RFP / scope)? Any constraints on accepted file types / size / storage?</w:t>
+              <w:t>Would you like a shorter, two-step enquiry form, and the option for visitors to upload a file (such as an existing certificate or a tender document)? Any limits on file type or size we should set?</w:t>
             </w:r>
           </w:p>
         </w:tc>
@@ -2456,13 +2453,13 @@
                 <w:b w:val="0"/>
                 <w:sz w:val="18"/>
               </w:rPr>
-              <w:t>Current form is single-step, no upload.</w:t>
+              <w:t>The current form is a single page with no file upload.</w:t>
             </w:r>
           </w:p>
         </w:tc>
         <w:tc>
           <w:tcPr>
-            <w:tcW w:type="dxa" w:w="3456"/>
+            <w:tcW w:type="dxa" w:w="3168"/>
           </w:tcPr>
           <w:p>
             <w:pPr>
@@ -2491,9 +2488,9 @@
             <w:r>
               <w:rPr>
                 <w:b/>
-                <w:sz w:val="21"/>
+                <w:sz w:val="22"/>
               </w:rPr>
-              <w:t>E. Legal / compliance sign-off</w:t>
+              <w:t>E.  Legal review</w:t>
             </w:r>
           </w:p>
         </w:tc>
@@ -2518,7 +2515,7 @@
         </w:tc>
         <w:tc>
           <w:tcPr>
-            <w:tcW w:type="dxa" w:w="2736"/>
+            <w:tcW w:type="dxa" w:w="2880"/>
           </w:tcPr>
           <w:p>
             <w:pPr>
@@ -2529,13 +2526,13 @@
                 <w:b/>
                 <w:sz w:val="18"/>
               </w:rPr>
-              <w:t>Legal review of policy pages [BLOCKS PUBLISH]</w:t>
+              <w:t>Legal sign-off on policy pages  (needed before we can publish)</w:t>
             </w:r>
           </w:p>
         </w:tc>
         <w:tc>
           <w:tcPr>
-            <w:tcW w:type="dxa" w:w="4896"/>
+            <w:tcW w:type="dxa" w:w="5040"/>
           </w:tcPr>
           <w:p>
             <w:pPr>
@@ -2546,7 +2543,7 @@
                 <w:b w:val="0"/>
                 <w:sz w:val="18"/>
               </w:rPr>
-              <w:t>Will ABS's legal team provide or sign off the final Privacy Policy, Cookie Policy and Terms text before publish? Confirm the retention period (you suggested “up to 3 years”) is legally approved.</w:t>
+              <w:t>Will your legal team write or approve the final Privacy Policy, Cookie Policy and Terms? Also, is a data-retention period of “up to 3 years” acceptable to you?</w:t>
             </w:r>
           </w:p>
         </w:tc>
@@ -2563,13 +2560,13 @@
                 <w:b w:val="0"/>
                 <w:sz w:val="18"/>
               </w:rPr>
-              <w:t>We will draft structured content per your guidance, but AI-drafted legal text must not go live unreviewed.</w:t>
+              <w:t>We will draft these pages in a clear structure based on your notes, but the exact legal wording should be checked by a lawyer before it goes public.</w:t>
             </w:r>
           </w:p>
         </w:tc>
         <w:tc>
           <w:tcPr>
-            <w:tcW w:type="dxa" w:w="3456"/>
+            <w:tcW w:type="dxa" w:w="3168"/>
           </w:tcPr>
           <w:p>
             <w:pPr>
@@ -2590,10 +2587,10 @@
       <w:r>
         <w:rPr>
           <w:i/>
-          <w:color w:val="777777"/>
-          <w:sz w:val="16"/>
+          <w:color w:val="666666"/>
+          <w:sz w:val="17"/>
         </w:rPr>
-        <w:t>Once we have A–C answered we can complete the remaining copy; D sets the build scope; E gates the legal pages. Prepared from the ABS Website Gap Correction Table review. Positioning correction + ISO edition updates already implemented and live.</w:t>
+        <w:t>Thank you. Once we have your answers to sections A–C we can finish the website text. Section D decides how much work the next stage involves, and Section E is about the legal pages.</w:t>
       </w:r>
     </w:p>
     <w:sectPr>

</xml_diff>